<commit_message>
Expand API evidence and update report branch link
</commit_message>
<xml_diff>
--- a/docs/mini-report-backend.docx
+++ b/docs/mini-report-backend.docx
@@ -247,7 +247,7 @@
           <w:color w:val="000000"/>
           <w:sz w:val="28"/>
         </w:rPr>
-        <w:t>Код серверной части опубликован в открытом репозитории GitHub в ветке codex/backend-mini-report. Адрес ветки:</w:t>
+        <w:t>Код серверной части опубликован в открытом репозитории GitHub в ветке backend. Адрес ветки:</w:t>
       </w:r>
     </w:p>
     <w:p>
@@ -261,7 +261,7 @@
             <w:rFonts w:ascii="Times New Roman" w:hAnsi="Times New Roman"/>
             <w:sz w:val="28"/>
           </w:rPr>
-          <w:t>https://github.com/Andrey787878/hackhaton/tree/codex/backend-mini-report</w:t>
+          <w:t>https://github.com/Andrey787878/hackhaton/tree/backend</w:t>
         </w:r>
       </w:hyperlink>
     </w:p>
@@ -447,11 +447,6 @@
       </w:r>
     </w:p>
     <w:p>
-      <w:r>
-        <w:br w:type="page"/>
-      </w:r>
-    </w:p>
-    <w:p>
       <w:pPr>
         <w:pStyle w:val="Heading1"/>
         <w:keepNext/>
@@ -482,7 +477,24 @@
           <w:color w:val="000000"/>
           <w:sz w:val="28"/>
         </w:rPr>
-        <w:t>На рисунке 1 показан Swagger UI запущенного сервера с маршрутами авторизации и управления доступом. OpenAPI доступен по адресу /openapi.json.</w:t>
+        <w:t>Swagger UI запущенного сервера содержит 73 операции в восьми разделах. На рисунках 1–4 последовательно показаны все группы API. Полная схема OpenAPI доступна по адресу /openapi.json.</w:t>
+      </w:r>
+    </w:p>
+    <w:p>
+      <w:pPr>
+        <w:keepNext/>
+        <w:spacing w:after="0"/>
+        <w:ind w:firstLine="709"/>
+        <w:jc w:val="both"/>
+      </w:pPr>
+      <w:r>
+        <w:rPr>
+          <w:rFonts w:ascii="Times New Roman" w:hAnsi="Times New Roman" w:eastAsia="Times New Roman"/>
+          <w:b w:val="0"/>
+          <w:color w:val="000000"/>
+          <w:sz w:val="28"/>
+        </w:rPr>
+        <w:t>На рисунке 1 показаны авторизация и начало управления ролями и правами.</w:t>
       </w:r>
     </w:p>
     <w:p>
@@ -495,7 +507,7 @@
       <w:r>
         <w:drawing>
           <wp:inline xmlns:a="http://schemas.openxmlformats.org/drawingml/2006/main" xmlns:pic="http://schemas.openxmlformats.org/drawingml/2006/picture">
-            <wp:extent cx="5580000" cy="3836250"/>
+            <wp:extent cx="5580000" cy="7905000"/>
             <wp:docPr id="1" name="Picture 1"/>
             <wp:cNvGraphicFramePr>
               <a:graphicFrameLocks noChangeAspect="1"/>
@@ -504,7 +516,7 @@
               <a:graphicData uri="http://schemas.openxmlformats.org/drawingml/2006/picture">
                 <pic:pic>
                   <pic:nvPicPr>
-                    <pic:cNvPr id="0" name="swagger.png"/>
+                    <pic:cNvPr id="0" name="swagger-1.png"/>
                     <pic:cNvPicPr/>
                   </pic:nvPicPr>
                   <pic:blipFill>
@@ -516,7 +528,7 @@
                   <pic:spPr>
                     <a:xfrm>
                       <a:off x="0" y="0"/>
-                      <a:ext cx="5580000" cy="3836250"/>
+                      <a:ext cx="5580000" cy="7905000"/>
                     </a:xfrm>
                     <a:prstGeom prst="rect"/>
                   </pic:spPr>
@@ -540,11 +552,12 @@
           <w:color w:val="000000"/>
           <w:sz w:val="28"/>
         </w:rPr>
-        <w:t>Рисунок 1 – Интерфейс Swagger UI серверного API</w:t>
+        <w:t>Рисунок 1 – Swagger UI: авторизация и управление доступом, часть 1</w:t>
       </w:r>
     </w:p>
     <w:p>
       <w:pPr>
+        <w:keepNext/>
         <w:spacing w:after="0"/>
         <w:ind w:firstLine="709"/>
         <w:jc w:val="both"/>
@@ -556,7 +569,232 @@
           <w:color w:val="000000"/>
           <w:sz w:val="28"/>
         </w:rPr>
-        <w:t>На рисунке 2 приведён успешный ответ GET /api/v1/health: сервер и подключение к PostgreSQL исправны.</w:t>
+        <w:t>На рисунке 2 показаны оставшиеся маршруты прав доступа и маршруты хакатонов.</w:t>
+      </w:r>
+    </w:p>
+    <w:p>
+      <w:pPr>
+        <w:keepNext/>
+        <w:spacing w:before="100" w:after="0"/>
+        <w:ind w:firstLine="0"/>
+        <w:jc w:val="center"/>
+      </w:pPr>
+      <w:r>
+        <w:drawing>
+          <wp:inline xmlns:a="http://schemas.openxmlformats.org/drawingml/2006/main" xmlns:pic="http://schemas.openxmlformats.org/drawingml/2006/picture">
+            <wp:extent cx="5580000" cy="7905000"/>
+            <wp:docPr id="2" name="Picture 2"/>
+            <wp:cNvGraphicFramePr>
+              <a:graphicFrameLocks noChangeAspect="1"/>
+            </wp:cNvGraphicFramePr>
+            <a:graphic>
+              <a:graphicData uri="http://schemas.openxmlformats.org/drawingml/2006/picture">
+                <pic:pic>
+                  <pic:nvPicPr>
+                    <pic:cNvPr id="0" name="swagger-2.png"/>
+                    <pic:cNvPicPr/>
+                  </pic:nvPicPr>
+                  <pic:blipFill>
+                    <a:blip r:embed="rId12"/>
+                    <a:stretch>
+                      <a:fillRect/>
+                    </a:stretch>
+                  </pic:blipFill>
+                  <pic:spPr>
+                    <a:xfrm>
+                      <a:off x="0" y="0"/>
+                      <a:ext cx="5580000" cy="7905000"/>
+                    </a:xfrm>
+                    <a:prstGeom prst="rect"/>
+                  </pic:spPr>
+                </pic:pic>
+              </a:graphicData>
+            </a:graphic>
+          </wp:inline>
+        </w:drawing>
+      </w:r>
+    </w:p>
+    <w:p>
+      <w:pPr>
+        <w:spacing w:before="60" w:after="160"/>
+        <w:ind w:firstLine="0"/>
+        <w:jc w:val="center"/>
+      </w:pPr>
+      <w:r>
+        <w:rPr>
+          <w:rFonts w:ascii="Times New Roman" w:hAnsi="Times New Roman" w:eastAsia="Times New Roman"/>
+          <w:b w:val="0"/>
+          <w:color w:val="000000"/>
+          <w:sz w:val="28"/>
+        </w:rPr>
+        <w:t>Рисунок 2 – Swagger UI: управление доступом, часть 2, и хакатоны</w:t>
+      </w:r>
+    </w:p>
+    <w:p>
+      <w:pPr>
+        <w:keepNext/>
+        <w:spacing w:after="0"/>
+        <w:ind w:firstLine="709"/>
+        <w:jc w:val="both"/>
+      </w:pPr>
+      <w:r>
+        <w:rPr>
+          <w:rFonts w:ascii="Times New Roman" w:hAnsi="Times New Roman" w:eastAsia="Times New Roman"/>
+          <w:b w:val="0"/>
+          <w:color w:val="000000"/>
+          <w:sz w:val="28"/>
+        </w:rPr>
+        <w:t>На рисунке 3 показаны команды, сдача решений и экспертная оценка.</w:t>
+      </w:r>
+    </w:p>
+    <w:p>
+      <w:pPr>
+        <w:keepNext/>
+        <w:spacing w:before="100" w:after="0"/>
+        <w:ind w:firstLine="0"/>
+        <w:jc w:val="center"/>
+      </w:pPr>
+      <w:r>
+        <w:drawing>
+          <wp:inline xmlns:a="http://schemas.openxmlformats.org/drawingml/2006/main" xmlns:pic="http://schemas.openxmlformats.org/drawingml/2006/picture">
+            <wp:extent cx="5580000" cy="7905000"/>
+            <wp:docPr id="3" name="Picture 3"/>
+            <wp:cNvGraphicFramePr>
+              <a:graphicFrameLocks noChangeAspect="1"/>
+            </wp:cNvGraphicFramePr>
+            <a:graphic>
+              <a:graphicData uri="http://schemas.openxmlformats.org/drawingml/2006/picture">
+                <pic:pic>
+                  <pic:nvPicPr>
+                    <pic:cNvPr id="0" name="swagger-3.png"/>
+                    <pic:cNvPicPr/>
+                  </pic:nvPicPr>
+                  <pic:blipFill>
+                    <a:blip r:embed="rId13"/>
+                    <a:stretch>
+                      <a:fillRect/>
+                    </a:stretch>
+                  </pic:blipFill>
+                  <pic:spPr>
+                    <a:xfrm>
+                      <a:off x="0" y="0"/>
+                      <a:ext cx="5580000" cy="7905000"/>
+                    </a:xfrm>
+                    <a:prstGeom prst="rect"/>
+                  </pic:spPr>
+                </pic:pic>
+              </a:graphicData>
+            </a:graphic>
+          </wp:inline>
+        </w:drawing>
+      </w:r>
+    </w:p>
+    <w:p>
+      <w:pPr>
+        <w:spacing w:before="60" w:after="160"/>
+        <w:ind w:firstLine="0"/>
+        <w:jc w:val="center"/>
+      </w:pPr>
+      <w:r>
+        <w:rPr>
+          <w:rFonts w:ascii="Times New Roman" w:hAnsi="Times New Roman" w:eastAsia="Times New Roman"/>
+          <w:b w:val="0"/>
+          <w:color w:val="000000"/>
+          <w:sz w:val="28"/>
+        </w:rPr>
+        <w:t>Рисунок 3 – Swagger UI: команды, решения и оценка</w:t>
+      </w:r>
+    </w:p>
+    <w:p>
+      <w:pPr>
+        <w:keepNext/>
+        <w:spacing w:after="0"/>
+        <w:ind w:firstLine="709"/>
+        <w:jc w:val="both"/>
+      </w:pPr>
+      <w:r>
+        <w:rPr>
+          <w:rFonts w:ascii="Times New Roman" w:hAnsi="Times New Roman" w:eastAsia="Times New Roman"/>
+          <w:b w:val="0"/>
+          <w:color w:val="000000"/>
+          <w:sz w:val="28"/>
+        </w:rPr>
+        <w:t>На рисунке 4 показаны уведомления и проверка работоспособности.</w:t>
+      </w:r>
+    </w:p>
+    <w:p>
+      <w:pPr>
+        <w:keepNext/>
+        <w:spacing w:before="100" w:after="0"/>
+        <w:ind w:firstLine="0"/>
+        <w:jc w:val="center"/>
+      </w:pPr>
+      <w:r>
+        <w:drawing>
+          <wp:inline xmlns:a="http://schemas.openxmlformats.org/drawingml/2006/main" xmlns:pic="http://schemas.openxmlformats.org/drawingml/2006/picture">
+            <wp:extent cx="5580000" cy="4650000"/>
+            <wp:docPr id="4" name="Picture 4"/>
+            <wp:cNvGraphicFramePr>
+              <a:graphicFrameLocks noChangeAspect="1"/>
+            </wp:cNvGraphicFramePr>
+            <a:graphic>
+              <a:graphicData uri="http://schemas.openxmlformats.org/drawingml/2006/picture">
+                <pic:pic>
+                  <pic:nvPicPr>
+                    <pic:cNvPr id="0" name="swagger-4.png"/>
+                    <pic:cNvPicPr/>
+                  </pic:nvPicPr>
+                  <pic:blipFill>
+                    <a:blip r:embed="rId14"/>
+                    <a:stretch>
+                      <a:fillRect/>
+                    </a:stretch>
+                  </pic:blipFill>
+                  <pic:spPr>
+                    <a:xfrm>
+                      <a:off x="0" y="0"/>
+                      <a:ext cx="5580000" cy="4650000"/>
+                    </a:xfrm>
+                    <a:prstGeom prst="rect"/>
+                  </pic:spPr>
+                </pic:pic>
+              </a:graphicData>
+            </a:graphic>
+          </wp:inline>
+        </w:drawing>
+      </w:r>
+    </w:p>
+    <w:p>
+      <w:pPr>
+        <w:spacing w:before="60" w:after="160"/>
+        <w:ind w:firstLine="0"/>
+        <w:jc w:val="center"/>
+      </w:pPr>
+      <w:r>
+        <w:rPr>
+          <w:rFonts w:ascii="Times New Roman" w:hAnsi="Times New Roman" w:eastAsia="Times New Roman"/>
+          <w:b w:val="0"/>
+          <w:color w:val="000000"/>
+          <w:sz w:val="28"/>
+        </w:rPr>
+        <w:t>Рисунок 4 – Swagger UI: уведомления и проверка API</w:t>
+      </w:r>
+    </w:p>
+    <w:p>
+      <w:pPr>
+        <w:keepNext/>
+        <w:spacing w:after="0"/>
+        <w:ind w:firstLine="709"/>
+        <w:jc w:val="both"/>
+      </w:pPr>
+      <w:r>
+        <w:rPr>
+          <w:rFonts w:ascii="Times New Roman" w:hAnsi="Times New Roman" w:eastAsia="Times New Roman"/>
+          <w:b w:val="0"/>
+          <w:color w:val="000000"/>
+          <w:sz w:val="28"/>
+        </w:rPr>
+        <w:t>На рисунке 5 приведён успешный ответ GET /api/v1/health: сервер и подключение к PostgreSQL исправны.</w:t>
       </w:r>
     </w:p>
     <w:p>
@@ -570,7 +808,7 @@
         <w:drawing>
           <wp:inline xmlns:a="http://schemas.openxmlformats.org/drawingml/2006/main" xmlns:pic="http://schemas.openxmlformats.org/drawingml/2006/picture">
             <wp:extent cx="5580000" cy="956571"/>
-            <wp:docPr id="2" name="Picture 2"/>
+            <wp:docPr id="5" name="Picture 5"/>
             <wp:cNvGraphicFramePr>
               <a:graphicFrameLocks noChangeAspect="1"/>
             </wp:cNvGraphicFramePr>
@@ -582,7 +820,7 @@
                     <pic:cNvPicPr/>
                   </pic:nvPicPr>
                   <pic:blipFill>
-                    <a:blip r:embed="rId12"/>
+                    <a:blip r:embed="rId15"/>
                     <a:stretch>
                       <a:fillRect/>
                     </a:stretch>
@@ -614,7 +852,7 @@
           <w:color w:val="000000"/>
           <w:sz w:val="28"/>
         </w:rPr>
-        <w:t>Рисунок 2 – Ответ проверки API и базы данных</w:t>
+        <w:t>Рисунок 5 – Ответ проверки API и базы данных</w:t>
       </w:r>
     </w:p>
     <w:p>
@@ -631,7 +869,7 @@
           <w:color w:val="000000"/>
           <w:sz w:val="28"/>
         </w:rPr>
-        <w:t>На рисунке 3 представлен ответ публичного GET-запроса рейтинга для кейса № 3: команда получила итог 85,00 балла по весовым критериям.</w:t>
+        <w:t>На рисунке 6 представлен ответ публичного GET-запроса рейтинга для кейса № 3: команда получила итог 85,00 балла по весовым критериям.</w:t>
       </w:r>
     </w:p>
     <w:p>
@@ -645,7 +883,7 @@
         <w:drawing>
           <wp:inline xmlns:a="http://schemas.openxmlformats.org/drawingml/2006/main" xmlns:pic="http://schemas.openxmlformats.org/drawingml/2006/picture">
             <wp:extent cx="5580000" cy="1036286"/>
-            <wp:docPr id="3" name="Picture 3"/>
+            <wp:docPr id="6" name="Picture 6"/>
             <wp:cNvGraphicFramePr>
               <a:graphicFrameLocks noChangeAspect="1"/>
             </wp:cNvGraphicFramePr>
@@ -657,7 +895,7 @@
                     <pic:cNvPicPr/>
                   </pic:nvPicPr>
                   <pic:blipFill>
-                    <a:blip r:embed="rId13"/>
+                    <a:blip r:embed="rId16"/>
                     <a:stretch>
                       <a:fillRect/>
                     </a:stretch>
@@ -689,7 +927,7 @@
           <w:color w:val="000000"/>
           <w:sz w:val="28"/>
         </w:rPr>
-        <w:t>Рисунок 3 – Публичный рейтинг по результатам экспертной оценки</w:t>
+        <w:t>Рисунок 6 – Публичный рейтинг по результатам экспертной оценки</w:t>
       </w:r>
     </w:p>
     <w:p>

</xml_diff>